<commit_message>
chore: Update StateMachineDiagram and UseCaseDiagram files
</commit_message>
<xml_diff>
--- a/diagrams/zahtevi.docx
+++ b/diagrams/zahtevi.docx
@@ -147,6 +147,28 @@
     </w:p>
     <w:p>
       <w:pPr>
+        <w:pStyle w:val="ListParagraph"/>
+        <w:numPr>
+          <w:ilvl w:val="0"/>
+          <w:numId w:val="2"/>
+        </w:numPr>
+        <w:spacing w:after="60"/>
+      </w:pPr>
+      <w:r>
+        <w:t>Administrator vr</w:t>
+      </w:r>
+      <w:r>
+        <w:rPr>
+          <w:lang w:val="sr-Latn-RS"/>
+        </w:rPr>
+        <w:t>ši kreiranje, ažuriranje i brisanje moguće opreme za vežbanje.</w:t>
+      </w:r>
+      <w:r>
+        <w:t xml:space="preserve"> </w:t>
+      </w:r>
+    </w:p>
+    <w:p>
+      <w:pPr>
         <w:pStyle w:val="Heading2"/>
       </w:pPr>
       <w:r>
@@ -298,7 +320,10 @@
         <w:spacing w:after="60"/>
       </w:pPr>
       <w:r>
-        <w:t>Trener ocenjuje i komentariše ceo održani trening klijenta (vidljivo samo drugim trenerima, ne i klijentu niti administratoru).</w:t>
+        <w:t>Trener ocenjuje i komentariše ceo održani trening klijenta</w:t>
+      </w:r>
+      <w:r>
+        <w:t>.</w:t>
       </w:r>
     </w:p>
     <w:p>
@@ -359,7 +384,13 @@
         <w:spacing w:after="60"/>
       </w:pPr>
       <w:r>
-        <w:t>Klijent može naknadno ažurirati podatke o težini, visini i zdravstvenom stanju; sistem čuva istoriju ovih podataka radi praćenja napretka.</w:t>
+        <w:t>Klijent može naknadno ažurirati podatke o težini, visini i zdravstvenom stanju</w:t>
+      </w:r>
+      <w:r>
+        <w:t>,</w:t>
+      </w:r>
+      <w:r>
+        <w:t xml:space="preserve"> sistem čuva istoriju ovih podataka radi praćenja napretka.</w:t>
       </w:r>
     </w:p>
     <w:p>
@@ -567,6 +598,44 @@
         <w:spacing w:after="60"/>
       </w:pPr>
       <w:r>
+        <w:t>Sistem automatski obaveštava korisnika o prihvatanju ili odbijanju zahteva za saradnju.</w:t>
+      </w:r>
+    </w:p>
+    <w:p>
+      <w:pPr>
+        <w:pStyle w:val="ListParagraph"/>
+        <w:numPr>
+          <w:ilvl w:val="0"/>
+          <w:numId w:val="2"/>
+        </w:numPr>
+        <w:spacing w:after="60"/>
+      </w:pPr>
+      <w:r>
+        <w:t xml:space="preserve">Sistem automatski obaveštava </w:t>
+      </w:r>
+      <w:r>
+        <w:t>trenera</w:t>
+      </w:r>
+      <w:r>
+        <w:t xml:space="preserve"> o prihvatanju ili odbijanju zahteva</w:t>
+      </w:r>
+      <w:r>
+        <w:t xml:space="preserve"> za </w:t>
+      </w:r>
+      <w:r>
+        <w:t>.</w:t>
+      </w:r>
+    </w:p>
+    <w:p>
+      <w:pPr>
+        <w:pStyle w:val="ListParagraph"/>
+        <w:numPr>
+          <w:ilvl w:val="0"/>
+          <w:numId w:val="2"/>
+        </w:numPr>
+        <w:spacing w:after="60"/>
+      </w:pPr>
+      <w:r>
         <w:t>Sistem automatski šalje obaveštenje klijentu pred istek čanarine.</w:t>
       </w:r>
     </w:p>
@@ -689,6 +758,25 @@
       </w:r>
       <w:r>
         <w:t>.</w:t>
+      </w:r>
+    </w:p>
+    <w:p>
+      <w:pPr>
+        <w:pStyle w:val="ListParagraph"/>
+        <w:numPr>
+          <w:ilvl w:val="0"/>
+          <w:numId w:val="3"/>
+        </w:numPr>
+        <w:spacing w:after="60"/>
+      </w:pPr>
+      <w:r>
+        <w:t xml:space="preserve">Potrebno je </w:t>
+      </w:r>
+      <w:r>
+        <w:rPr>
+          <w:lang w:val="sr-Latn-RS"/>
+        </w:rPr>
+        <w:t>heširati lozinke radi veće sigurnosti korisničkih podataka.</w:t>
       </w:r>
     </w:p>
     <w:p>

</xml_diff>